<commit_message>
Supplement: add multicomponent + deconvolution negatives (§S5, Table S2, FigS3/S4)
New §S5 documents the second endpoint (single- vs multi-component): Table S2 with
all 14 families + peak deconvolution against the multicomponent label, the
UA-purity confound on the combined model (proven by calcium-only 0.55 ns and
>=25% threshold 0.49), and the deconvolution null (partial volume erases the
two-peak structure at 3mm). FigS3 (decision nodes) and FigS4 (multicomponent
forest) added; rationale notes the two endpoints.

Co-Authored-By: Claude Opus 4.8 <noreply@anthropic.com>
</commit_message>
<xml_diff>
--- a/docs/02_DrStone_Supplement_FeatureLedger.docx
+++ b/docs/02_DrStone_Supplement_FeatureLedger.docx
@@ -1913,7 +1913,1149 @@
         <w:pStyle w:val="Heading2"/>
       </w:pPr>
       <w:r>
-        <w:t>S5. Figures</w:t>
+        <w:t>S5. A second endpoint — multicomponent detection (an exhaustive negative)</w:t>
+      </w:r>
+    </w:p>
+    <w:p>
+      <w:r>
+        <w:t xml:space="preserve">Recasting the problem around management decisions (main text §3.7) raises a distinct, coarser question grounded in stone pathophysiology: most stones are </w:t>
+      </w:r>
+      <w:r>
+        <w:rPr>
+          <w:b/>
+        </w:rPr>
+        <w:t>multicomponent</w:t>
+      </w:r>
+      <w:r>
+        <w:t xml:space="preserve"> (68% here), laminating a nidus with a shell of different composition — so </w:t>
+      </w:r>
+      <w:r>
+        <w:rPr>
+          <w:b/>
+        </w:rPr>
+        <w:t>can any routine‑data channel detect *that a stone is mixed*, without resolving what it is mixed of?</w:t>
+      </w:r>
+      <w:r>
+        <w:t xml:space="preserve"> This is a lower bar than composition subtyping (heterogeneity, not identity) with better‑balanced classes, and it was tested exhaustively. Every feature family of the study — plus a dedicated </w:t>
+      </w:r>
+      <w:r>
+        <w:rPr>
+          <w:b/>
+        </w:rPr>
+        <w:t>peak‑deconvolution</w:t>
+      </w:r>
+      <w:r>
+        <w:t xml:space="preserve"> family added for this question (per‑stone 1‑ vs 2‑Gaussian mixture fits: peak separation, Sarle's bimodality coefficient, skewness, and the 2‑vs‑1 BIC evidence) — was evaluated against the multicomponent label under the same patient‑grouped CV with clustered bootstrap.</w:t>
+      </w:r>
+    </w:p>
+    <w:p>
+      <w:r>
+        <w:rPr>
+          <w:b/>
+        </w:rPr>
+        <w:t>Table S2. Multicomponent detection by channel</w:t>
+      </w:r>
+      <w:r>
+        <w:t xml:space="preserve"> (multicomponent = second‑component fraction ≥ 10%; AUROC, patient‑clustered bootstrap 95% CI; Figure S4).</w:t>
+      </w:r>
+    </w:p>
+    <w:tbl>
+      <w:tblPr>
+        <w:tblStyle w:val="LightGrid-Accent1"/>
+        <w:tblW w:type="auto" w:w="0"/>
+        <w:tblLook w:firstColumn="1" w:firstRow="1" w:lastColumn="0" w:lastRow="0" w:noHBand="0" w:noVBand="1" w:val="04A0"/>
+      </w:tblPr>
+      <w:tblGrid>
+        <w:gridCol w:w="2160"/>
+        <w:gridCol w:w="2160"/>
+        <w:gridCol w:w="2160"/>
+        <w:gridCol w:w="2160"/>
+      </w:tblGrid>
+      <w:tr>
+        <w:tc>
+          <w:tcPr>
+            <w:tcW w:type="dxa" w:w="2160"/>
+          </w:tcPr>
+          <w:p>
+            <w:r/>
+            <w:r>
+              <w:rPr>
+                <w:b/>
+                <w:sz w:val="16"/>
+              </w:rPr>
+              <w:t>Channel</w:t>
+            </w:r>
+          </w:p>
+        </w:tc>
+        <w:tc>
+          <w:tcPr>
+            <w:tcW w:type="dxa" w:w="2160"/>
+          </w:tcPr>
+          <w:p>
+            <w:r/>
+            <w:r>
+              <w:rPr>
+                <w:b/>
+                <w:sz w:val="16"/>
+              </w:rPr>
+              <w:t>n feat</w:t>
+            </w:r>
+          </w:p>
+        </w:tc>
+        <w:tc>
+          <w:tcPr>
+            <w:tcW w:type="dxa" w:w="2160"/>
+          </w:tcPr>
+          <w:p>
+            <w:r/>
+            <w:r>
+              <w:rPr>
+                <w:b/>
+                <w:sz w:val="16"/>
+              </w:rPr>
+              <w:t>AUROC (95% CI)</w:t>
+            </w:r>
+          </w:p>
+        </w:tc>
+        <w:tc>
+          <w:tcPr>
+            <w:tcW w:type="dxa" w:w="2160"/>
+          </w:tcPr>
+          <w:p>
+            <w:r/>
+            <w:r>
+              <w:rPr>
+                <w:b/>
+                <w:sz w:val="16"/>
+              </w:rPr>
+              <w:t>Verdict</w:t>
+            </w:r>
+          </w:p>
+        </w:tc>
+      </w:tr>
+      <w:tr>
+        <w:tc>
+          <w:tcPr>
+            <w:tcW w:type="dxa" w:w="2160"/>
+          </w:tcPr>
+          <w:p>
+            <w:r/>
+            <w:r>
+              <w:rPr>
+                <w:sz w:val="16"/>
+              </w:rPr>
+              <w:t>Stone HU (base)</w:t>
+            </w:r>
+          </w:p>
+        </w:tc>
+        <w:tc>
+          <w:tcPr>
+            <w:tcW w:type="dxa" w:w="2160"/>
+          </w:tcPr>
+          <w:p>
+            <w:r/>
+            <w:r>
+              <w:rPr>
+                <w:sz w:val="16"/>
+              </w:rPr>
+              <w:t>5</w:t>
+            </w:r>
+          </w:p>
+        </w:tc>
+        <w:tc>
+          <w:tcPr>
+            <w:tcW w:type="dxa" w:w="2160"/>
+          </w:tcPr>
+          <w:p>
+            <w:r/>
+            <w:r>
+              <w:rPr>
+                <w:sz w:val="16"/>
+              </w:rPr>
+              <w:t>0.552 (0.480–0.625)</w:t>
+            </w:r>
+          </w:p>
+        </w:tc>
+        <w:tc>
+          <w:tcPr>
+            <w:tcW w:type="dxa" w:w="2160"/>
+          </w:tcPr>
+          <w:p>
+            <w:r/>
+            <w:r>
+              <w:rPr>
+                <w:sz w:val="16"/>
+              </w:rPr>
+              <w:t>null</w:t>
+            </w:r>
+          </w:p>
+        </w:tc>
+      </w:tr>
+      <w:tr>
+        <w:tc>
+          <w:tcPr>
+            <w:tcW w:type="dxa" w:w="2160"/>
+          </w:tcPr>
+          <w:p>
+            <w:r/>
+            <w:r>
+              <w:rPr>
+                <w:sz w:val="16"/>
+              </w:rPr>
+              <w:t>HU‑shape radiomics</w:t>
+            </w:r>
+          </w:p>
+        </w:tc>
+        <w:tc>
+          <w:tcPr>
+            <w:tcW w:type="dxa" w:w="2160"/>
+          </w:tcPr>
+          <w:p>
+            <w:r/>
+            <w:r>
+              <w:rPr>
+                <w:sz w:val="16"/>
+              </w:rPr>
+              <w:t>10</w:t>
+            </w:r>
+          </w:p>
+        </w:tc>
+        <w:tc>
+          <w:tcPr>
+            <w:tcW w:type="dxa" w:w="2160"/>
+          </w:tcPr>
+          <w:p>
+            <w:r/>
+            <w:r>
+              <w:rPr>
+                <w:sz w:val="16"/>
+              </w:rPr>
+              <w:t>0.553 (0.482–0.619)</w:t>
+            </w:r>
+          </w:p>
+        </w:tc>
+        <w:tc>
+          <w:tcPr>
+            <w:tcW w:type="dxa" w:w="2160"/>
+          </w:tcPr>
+          <w:p>
+            <w:r/>
+            <w:r>
+              <w:rPr>
+                <w:sz w:val="16"/>
+              </w:rPr>
+              <w:t>null</w:t>
+            </w:r>
+          </w:p>
+        </w:tc>
+      </w:tr>
+      <w:tr>
+        <w:tc>
+          <w:tcPr>
+            <w:tcW w:type="dxa" w:w="2160"/>
+          </w:tcPr>
+          <w:p>
+            <w:r/>
+            <w:r>
+              <w:rPr>
+                <w:sz w:val="16"/>
+              </w:rPr>
+              <w:t>Density gradient</w:t>
+            </w:r>
+          </w:p>
+        </w:tc>
+        <w:tc>
+          <w:tcPr>
+            <w:tcW w:type="dxa" w:w="2160"/>
+          </w:tcPr>
+          <w:p>
+            <w:r/>
+            <w:r>
+              <w:rPr>
+                <w:sz w:val="16"/>
+              </w:rPr>
+              <w:t>1</w:t>
+            </w:r>
+          </w:p>
+        </w:tc>
+        <w:tc>
+          <w:tcPr>
+            <w:tcW w:type="dxa" w:w="2160"/>
+          </w:tcPr>
+          <w:p>
+            <w:r/>
+            <w:r>
+              <w:rPr>
+                <w:sz w:val="16"/>
+              </w:rPr>
+              <w:t>0.426 (0.353–0.496)</w:t>
+            </w:r>
+          </w:p>
+        </w:tc>
+        <w:tc>
+          <w:tcPr>
+            <w:tcW w:type="dxa" w:w="2160"/>
+          </w:tcPr>
+          <w:p>
+            <w:r/>
+            <w:r>
+              <w:rPr>
+                <w:sz w:val="16"/>
+              </w:rPr>
+              <w:t>below chance</w:t>
+            </w:r>
+          </w:p>
+        </w:tc>
+      </w:tr>
+      <w:tr>
+        <w:tc>
+          <w:tcPr>
+            <w:tcW w:type="dxa" w:w="2160"/>
+          </w:tcPr>
+          <w:p>
+            <w:r/>
+            <w:r>
+              <w:rPr>
+                <w:sz w:val="16"/>
+              </w:rPr>
+              <w:t>Hb‑calibrated HU</w:t>
+            </w:r>
+          </w:p>
+        </w:tc>
+        <w:tc>
+          <w:tcPr>
+            <w:tcW w:type="dxa" w:w="2160"/>
+          </w:tcPr>
+          <w:p>
+            <w:r/>
+            <w:r>
+              <w:rPr>
+                <w:sz w:val="16"/>
+              </w:rPr>
+              <w:t>3</w:t>
+            </w:r>
+          </w:p>
+        </w:tc>
+        <w:tc>
+          <w:tcPr>
+            <w:tcW w:type="dxa" w:w="2160"/>
+          </w:tcPr>
+          <w:p>
+            <w:r/>
+            <w:r>
+              <w:rPr>
+                <w:sz w:val="16"/>
+              </w:rPr>
+              <w:t>0.422 (0.356–0.491)</w:t>
+            </w:r>
+          </w:p>
+        </w:tc>
+        <w:tc>
+          <w:tcPr>
+            <w:tcW w:type="dxa" w:w="2160"/>
+          </w:tcPr>
+          <w:p>
+            <w:r/>
+            <w:r>
+              <w:rPr>
+                <w:sz w:val="16"/>
+              </w:rPr>
+              <w:t>below chance</w:t>
+            </w:r>
+          </w:p>
+        </w:tc>
+      </w:tr>
+      <w:tr>
+        <w:tc>
+          <w:tcPr>
+            <w:tcW w:type="dxa" w:w="2160"/>
+          </w:tcPr>
+          <w:p>
+            <w:r/>
+            <w:r>
+              <w:rPr>
+                <w:sz w:val="16"/>
+              </w:rPr>
+              <w:t>CNN deep features</w:t>
+            </w:r>
+          </w:p>
+        </w:tc>
+        <w:tc>
+          <w:tcPr>
+            <w:tcW w:type="dxa" w:w="2160"/>
+          </w:tcPr>
+          <w:p>
+            <w:r/>
+            <w:r>
+              <w:rPr>
+                <w:sz w:val="16"/>
+              </w:rPr>
+              <w:t>64</w:t>
+            </w:r>
+          </w:p>
+        </w:tc>
+        <w:tc>
+          <w:tcPr>
+            <w:tcW w:type="dxa" w:w="2160"/>
+          </w:tcPr>
+          <w:p>
+            <w:r/>
+            <w:r>
+              <w:rPr>
+                <w:sz w:val="16"/>
+              </w:rPr>
+              <w:t>0.480 (0.413–0.545)</w:t>
+            </w:r>
+          </w:p>
+        </w:tc>
+        <w:tc>
+          <w:tcPr>
+            <w:tcW w:type="dxa" w:w="2160"/>
+          </w:tcPr>
+          <w:p>
+            <w:r/>
+            <w:r>
+              <w:rPr>
+                <w:sz w:val="16"/>
+              </w:rPr>
+              <w:t>null</w:t>
+            </w:r>
+          </w:p>
+        </w:tc>
+      </w:tr>
+      <w:tr>
+        <w:tc>
+          <w:tcPr>
+            <w:tcW w:type="dxa" w:w="2160"/>
+          </w:tcPr>
+          <w:p>
+            <w:r/>
+            <w:r>
+              <w:rPr>
+                <w:sz w:val="16"/>
+              </w:rPr>
+              <w:t>Labs / urine</w:t>
+            </w:r>
+          </w:p>
+        </w:tc>
+        <w:tc>
+          <w:tcPr>
+            <w:tcW w:type="dxa" w:w="2160"/>
+          </w:tcPr>
+          <w:p>
+            <w:r/>
+            <w:r>
+              <w:rPr>
+                <w:sz w:val="16"/>
+              </w:rPr>
+              <w:t>10</w:t>
+            </w:r>
+          </w:p>
+        </w:tc>
+        <w:tc>
+          <w:tcPr>
+            <w:tcW w:type="dxa" w:w="2160"/>
+          </w:tcPr>
+          <w:p>
+            <w:r/>
+            <w:r>
+              <w:rPr>
+                <w:sz w:val="16"/>
+              </w:rPr>
+              <w:t>0.484 (0.415–0.549)</w:t>
+            </w:r>
+          </w:p>
+        </w:tc>
+        <w:tc>
+          <w:tcPr>
+            <w:tcW w:type="dxa" w:w="2160"/>
+          </w:tcPr>
+          <w:p>
+            <w:r/>
+            <w:r>
+              <w:rPr>
+                <w:sz w:val="16"/>
+              </w:rPr>
+              <w:t>null</w:t>
+            </w:r>
+          </w:p>
+        </w:tc>
+      </w:tr>
+      <w:tr>
+        <w:tc>
+          <w:tcPr>
+            <w:tcW w:type="dxa" w:w="2160"/>
+          </w:tcPr>
+          <w:p>
+            <w:r/>
+            <w:r>
+              <w:rPr>
+                <w:sz w:val="16"/>
+              </w:rPr>
+              <w:t>Derived acid–base + eGFR</w:t>
+            </w:r>
+          </w:p>
+        </w:tc>
+        <w:tc>
+          <w:tcPr>
+            <w:tcW w:type="dxa" w:w="2160"/>
+          </w:tcPr>
+          <w:p>
+            <w:r/>
+            <w:r>
+              <w:rPr>
+                <w:sz w:val="16"/>
+              </w:rPr>
+              <w:t>3</w:t>
+            </w:r>
+          </w:p>
+        </w:tc>
+        <w:tc>
+          <w:tcPr>
+            <w:tcW w:type="dxa" w:w="2160"/>
+          </w:tcPr>
+          <w:p>
+            <w:r/>
+            <w:r>
+              <w:rPr>
+                <w:sz w:val="16"/>
+              </w:rPr>
+              <w:t>0.433 (0.360–0.507)</w:t>
+            </w:r>
+          </w:p>
+        </w:tc>
+        <w:tc>
+          <w:tcPr>
+            <w:tcW w:type="dxa" w:w="2160"/>
+          </w:tcPr>
+          <w:p>
+            <w:r/>
+            <w:r>
+              <w:rPr>
+                <w:sz w:val="16"/>
+              </w:rPr>
+              <w:t>null</w:t>
+            </w:r>
+          </w:p>
+        </w:tc>
+      </w:tr>
+      <w:tr>
+        <w:tc>
+          <w:tcPr>
+            <w:tcW w:type="dxa" w:w="2160"/>
+          </w:tcPr>
+          <w:p>
+            <w:r/>
+            <w:r>
+              <w:rPr>
+                <w:sz w:val="16"/>
+              </w:rPr>
+              <w:t>Demographics</w:t>
+            </w:r>
+          </w:p>
+        </w:tc>
+        <w:tc>
+          <w:tcPr>
+            <w:tcW w:type="dxa" w:w="2160"/>
+          </w:tcPr>
+          <w:p>
+            <w:r/>
+            <w:r>
+              <w:rPr>
+                <w:sz w:val="16"/>
+              </w:rPr>
+              <w:t>2</w:t>
+            </w:r>
+          </w:p>
+        </w:tc>
+        <w:tc>
+          <w:tcPr>
+            <w:tcW w:type="dxa" w:w="2160"/>
+          </w:tcPr>
+          <w:p>
+            <w:r/>
+            <w:r>
+              <w:rPr>
+                <w:sz w:val="16"/>
+              </w:rPr>
+              <w:t>0.435 (0.367–0.504)</w:t>
+            </w:r>
+          </w:p>
+        </w:tc>
+        <w:tc>
+          <w:tcPr>
+            <w:tcW w:type="dxa" w:w="2160"/>
+          </w:tcPr>
+          <w:p>
+            <w:r/>
+            <w:r>
+              <w:rPr>
+                <w:sz w:val="16"/>
+              </w:rPr>
+              <w:t>null</w:t>
+            </w:r>
+          </w:p>
+        </w:tc>
+      </w:tr>
+      <w:tr>
+        <w:tc>
+          <w:tcPr>
+            <w:tcW w:type="dxa" w:w="2160"/>
+          </w:tcPr>
+          <w:p>
+            <w:r/>
+            <w:r>
+              <w:rPr>
+                <w:sz w:val="16"/>
+              </w:rPr>
+              <w:t>Nephrocalcinosis</w:t>
+            </w:r>
+          </w:p>
+        </w:tc>
+        <w:tc>
+          <w:tcPr>
+            <w:tcW w:type="dxa" w:w="2160"/>
+          </w:tcPr>
+          <w:p>
+            <w:r/>
+            <w:r>
+              <w:rPr>
+                <w:sz w:val="16"/>
+              </w:rPr>
+              <w:t>4</w:t>
+            </w:r>
+          </w:p>
+        </w:tc>
+        <w:tc>
+          <w:tcPr>
+            <w:tcW w:type="dxa" w:w="2160"/>
+          </w:tcPr>
+          <w:p>
+            <w:r/>
+            <w:r>
+              <w:rPr>
+                <w:sz w:val="16"/>
+              </w:rPr>
+              <w:t>0.357 (0.290–0.428)</w:t>
+            </w:r>
+          </w:p>
+        </w:tc>
+        <w:tc>
+          <w:tcPr>
+            <w:tcW w:type="dxa" w:w="2160"/>
+          </w:tcPr>
+          <w:p>
+            <w:r/>
+            <w:r>
+              <w:rPr>
+                <w:sz w:val="16"/>
+              </w:rPr>
+              <w:t>below chance</w:t>
+            </w:r>
+          </w:p>
+        </w:tc>
+      </w:tr>
+      <w:tr>
+        <w:tc>
+          <w:tcPr>
+            <w:tcW w:type="dxa" w:w="2160"/>
+          </w:tcPr>
+          <w:p>
+            <w:r/>
+            <w:r>
+              <w:rPr>
+                <w:sz w:val="16"/>
+              </w:rPr>
+              <w:t>Vertebral BMD</w:t>
+            </w:r>
+          </w:p>
+        </w:tc>
+        <w:tc>
+          <w:tcPr>
+            <w:tcW w:type="dxa" w:w="2160"/>
+          </w:tcPr>
+          <w:p>
+            <w:r/>
+            <w:r>
+              <w:rPr>
+                <w:sz w:val="16"/>
+              </w:rPr>
+              <w:t>2</w:t>
+            </w:r>
+          </w:p>
+        </w:tc>
+        <w:tc>
+          <w:tcPr>
+            <w:tcW w:type="dxa" w:w="2160"/>
+          </w:tcPr>
+          <w:p>
+            <w:r/>
+            <w:r>
+              <w:rPr>
+                <w:sz w:val="16"/>
+              </w:rPr>
+              <w:t>0.459 (0.390–0.527)</w:t>
+            </w:r>
+          </w:p>
+        </w:tc>
+        <w:tc>
+          <w:tcPr>
+            <w:tcW w:type="dxa" w:w="2160"/>
+          </w:tcPr>
+          <w:p>
+            <w:r/>
+            <w:r>
+              <w:rPr>
+                <w:sz w:val="16"/>
+              </w:rPr>
+              <w:t>null</w:t>
+            </w:r>
+          </w:p>
+        </w:tc>
+      </w:tr>
+      <w:tr>
+        <w:tc>
+          <w:tcPr>
+            <w:tcW w:type="dxa" w:w="2160"/>
+          </w:tcPr>
+          <w:p>
+            <w:r/>
+            <w:r>
+              <w:rPr>
+                <w:sz w:val="16"/>
+              </w:rPr>
+              <w:t>Hepatic steatosis</w:t>
+            </w:r>
+          </w:p>
+        </w:tc>
+        <w:tc>
+          <w:tcPr>
+            <w:tcW w:type="dxa" w:w="2160"/>
+          </w:tcPr>
+          <w:p>
+            <w:r/>
+            <w:r>
+              <w:rPr>
+                <w:sz w:val="16"/>
+              </w:rPr>
+              <w:t>3</w:t>
+            </w:r>
+          </w:p>
+        </w:tc>
+        <w:tc>
+          <w:tcPr>
+            <w:tcW w:type="dxa" w:w="2160"/>
+          </w:tcPr>
+          <w:p>
+            <w:r/>
+            <w:r>
+              <w:rPr>
+                <w:sz w:val="16"/>
+              </w:rPr>
+              <w:t>0.569 (0.488–0.649)</w:t>
+            </w:r>
+          </w:p>
+        </w:tc>
+        <w:tc>
+          <w:tcPr>
+            <w:tcW w:type="dxa" w:w="2160"/>
+          </w:tcPr>
+          <w:p>
+            <w:r/>
+            <w:r>
+              <w:rPr>
+                <w:sz w:val="16"/>
+              </w:rPr>
+              <w:t>null</w:t>
+            </w:r>
+          </w:p>
+        </w:tc>
+      </w:tr>
+      <w:tr>
+        <w:tc>
+          <w:tcPr>
+            <w:tcW w:type="dxa" w:w="2160"/>
+          </w:tcPr>
+          <w:p>
+            <w:r/>
+            <w:r>
+              <w:rPr>
+                <w:sz w:val="16"/>
+              </w:rPr>
+              <w:t>Sarcopenia</w:t>
+            </w:r>
+          </w:p>
+        </w:tc>
+        <w:tc>
+          <w:tcPr>
+            <w:tcW w:type="dxa" w:w="2160"/>
+          </w:tcPr>
+          <w:p>
+            <w:r/>
+            <w:r>
+              <w:rPr>
+                <w:sz w:val="16"/>
+              </w:rPr>
+              <w:t>2</w:t>
+            </w:r>
+          </w:p>
+        </w:tc>
+        <w:tc>
+          <w:tcPr>
+            <w:tcW w:type="dxa" w:w="2160"/>
+          </w:tcPr>
+          <w:p>
+            <w:r/>
+            <w:r>
+              <w:rPr>
+                <w:sz w:val="16"/>
+              </w:rPr>
+              <w:t>0.481 (0.407–0.559)</w:t>
+            </w:r>
+          </w:p>
+        </w:tc>
+        <w:tc>
+          <w:tcPr>
+            <w:tcW w:type="dxa" w:w="2160"/>
+          </w:tcPr>
+          <w:p>
+            <w:r/>
+            <w:r>
+              <w:rPr>
+                <w:sz w:val="16"/>
+              </w:rPr>
+              <w:t>null</w:t>
+            </w:r>
+          </w:p>
+        </w:tc>
+      </w:tr>
+      <w:tr>
+        <w:tc>
+          <w:tcPr>
+            <w:tcW w:type="dxa" w:w="2160"/>
+          </w:tcPr>
+          <w:p>
+            <w:r/>
+            <w:r>
+              <w:rPr>
+                <w:sz w:val="16"/>
+              </w:rPr>
+              <w:t>Aortic calcification</w:t>
+            </w:r>
+          </w:p>
+        </w:tc>
+        <w:tc>
+          <w:tcPr>
+            <w:tcW w:type="dxa" w:w="2160"/>
+          </w:tcPr>
+          <w:p>
+            <w:r/>
+            <w:r>
+              <w:rPr>
+                <w:sz w:val="16"/>
+              </w:rPr>
+              <w:t>3</w:t>
+            </w:r>
+          </w:p>
+        </w:tc>
+        <w:tc>
+          <w:tcPr>
+            <w:tcW w:type="dxa" w:w="2160"/>
+          </w:tcPr>
+          <w:p>
+            <w:r/>
+            <w:r>
+              <w:rPr>
+                <w:sz w:val="16"/>
+              </w:rPr>
+              <w:t>0.427 (0.360–0.494)</w:t>
+            </w:r>
+          </w:p>
+        </w:tc>
+        <w:tc>
+          <w:tcPr>
+            <w:tcW w:type="dxa" w:w="2160"/>
+          </w:tcPr>
+          <w:p>
+            <w:r/>
+            <w:r>
+              <w:rPr>
+                <w:sz w:val="16"/>
+              </w:rPr>
+              <w:t>below chance</w:t>
+            </w:r>
+          </w:p>
+        </w:tc>
+      </w:tr>
+      <w:tr>
+        <w:tc>
+          <w:tcPr>
+            <w:tcW w:type="dxa" w:w="2160"/>
+          </w:tcPr>
+          <w:p>
+            <w:r/>
+            <w:r>
+              <w:rPr>
+                <w:sz w:val="16"/>
+              </w:rPr>
+              <w:t>Bladder / prostate</w:t>
+            </w:r>
+          </w:p>
+        </w:tc>
+        <w:tc>
+          <w:tcPr>
+            <w:tcW w:type="dxa" w:w="2160"/>
+          </w:tcPr>
+          <w:p>
+            <w:r/>
+            <w:r>
+              <w:rPr>
+                <w:sz w:val="16"/>
+              </w:rPr>
+              <w:t>3</w:t>
+            </w:r>
+          </w:p>
+        </w:tc>
+        <w:tc>
+          <w:tcPr>
+            <w:tcW w:type="dxa" w:w="2160"/>
+          </w:tcPr>
+          <w:p>
+            <w:r/>
+            <w:r>
+              <w:rPr>
+                <w:sz w:val="16"/>
+              </w:rPr>
+              <w:t>0.414 (0.345–0.485)</w:t>
+            </w:r>
+          </w:p>
+        </w:tc>
+        <w:tc>
+          <w:tcPr>
+            <w:tcW w:type="dxa" w:w="2160"/>
+          </w:tcPr>
+          <w:p>
+            <w:r/>
+            <w:r>
+              <w:rPr>
+                <w:sz w:val="16"/>
+              </w:rPr>
+              <w:t>below chance</w:t>
+            </w:r>
+          </w:p>
+        </w:tc>
+      </w:tr>
+      <w:tr>
+        <w:tc>
+          <w:tcPr>
+            <w:tcW w:type="dxa" w:w="2160"/>
+          </w:tcPr>
+          <w:p>
+            <w:r/>
+            <w:r>
+              <w:rPr>
+                <w:b/>
+                <w:sz w:val="16"/>
+              </w:rPr>
+              <w:t>Peak deconvolution</w:t>
+            </w:r>
+          </w:p>
+        </w:tc>
+        <w:tc>
+          <w:tcPr>
+            <w:tcW w:type="dxa" w:w="2160"/>
+          </w:tcPr>
+          <w:p>
+            <w:r/>
+            <w:r>
+              <w:rPr>
+                <w:sz w:val="16"/>
+              </w:rPr>
+              <w:t>5</w:t>
+            </w:r>
+          </w:p>
+        </w:tc>
+        <w:tc>
+          <w:tcPr>
+            <w:tcW w:type="dxa" w:w="2160"/>
+          </w:tcPr>
+          <w:p>
+            <w:r/>
+            <w:r>
+              <w:rPr>
+                <w:sz w:val="16"/>
+              </w:rPr>
+              <w:t>0.527 (0.455–0.598)</w:t>
+            </w:r>
+          </w:p>
+        </w:tc>
+        <w:tc>
+          <w:tcPr>
+            <w:tcW w:type="dxa" w:w="2160"/>
+          </w:tcPr>
+          <w:p>
+            <w:r/>
+            <w:r>
+              <w:rPr>
+                <w:sz w:val="16"/>
+              </w:rPr>
+              <w:t>null (0.375 at ≥25%)</w:t>
+            </w:r>
+          </w:p>
+        </w:tc>
+      </w:tr>
+      <w:tr>
+        <w:tc>
+          <w:tcPr>
+            <w:tcW w:type="dxa" w:w="2160"/>
+          </w:tcPr>
+          <w:p>
+            <w:r/>
+            <w:r>
+              <w:rPr>
+                <w:b/>
+                <w:sz w:val="16"/>
+              </w:rPr>
+              <w:t>All combined</w:t>
+            </w:r>
+          </w:p>
+        </w:tc>
+        <w:tc>
+          <w:tcPr>
+            <w:tcW w:type="dxa" w:w="2160"/>
+          </w:tcPr>
+          <w:p>
+            <w:r/>
+            <w:r>
+              <w:rPr>
+                <w:sz w:val="16"/>
+              </w:rPr>
+              <w:t>115</w:t>
+            </w:r>
+          </w:p>
+        </w:tc>
+        <w:tc>
+          <w:tcPr>
+            <w:tcW w:type="dxa" w:w="2160"/>
+          </w:tcPr>
+          <w:p>
+            <w:r/>
+            <w:r>
+              <w:rPr>
+                <w:sz w:val="16"/>
+              </w:rPr>
+              <w:t>0.626 (0.557–0.695)</w:t>
+            </w:r>
+          </w:p>
+        </w:tc>
+        <w:tc>
+          <w:tcPr>
+            <w:tcW w:type="dxa" w:w="2160"/>
+          </w:tcPr>
+          <w:p>
+            <w:r/>
+            <w:r>
+              <w:rPr>
+                <w:b/>
+                <w:sz w:val="16"/>
+              </w:rPr>
+              <w:t>UA‑purity confound</w:t>
+            </w:r>
+          </w:p>
+        </w:tc>
+      </w:tr>
+    </w:tbl>
+    <w:p>
+      <w:r>
+        <w:rPr>
+          <w:b/>
+        </w:rPr>
+        <w:t>No channel detects multicomponent structure.</w:t>
+      </w:r>
+      <w:r>
+        <w:t xml:space="preserve"> Every individual family's interval crosses chance, several below it. The single apparent gain — the 115‑feature combined model at </w:t>
+      </w:r>
+      <w:r>
+        <w:rPr>
+          <w:b/>
+        </w:rPr>
+        <w:t>0.626 (0.557–0.695)</w:t>
+      </w:r>
+      <w:r>
+        <w:t xml:space="preserve"> — is a </w:t>
+      </w:r>
+      <w:r>
+        <w:rPr>
+          <w:b/>
+        </w:rPr>
+        <w:t>uric‑acid‑purity confound</w:t>
+      </w:r>
+      <w:r>
+        <w:t xml:space="preserve">, not multicomponent detection: uric‑acid stones are </w:t>
+      </w:r>
+      <w:r>
+        <w:rPr>
+          <w:b/>
+        </w:rPr>
+        <w:t>39% multicomponent vs. 72% for non‑UA</w:t>
+      </w:r>
+      <w:r>
+        <w:t xml:space="preserve">, so predicting "mixed" is largely predicting "not‑UA," which the model already does (Node A). Two orthogonal controls expose it: restricting to calcium stones (removing the UA axis) drops the combined model to </w:t>
+      </w:r>
+      <w:r>
+        <w:rPr>
+          <w:b/>
+        </w:rPr>
+        <w:t>0.549 (non‑significant)</w:t>
+      </w:r>
+      <w:r>
+        <w:t xml:space="preserve">, and a clean ≥25% mixedness threshold drops it to </w:t>
+      </w:r>
+      <w:r>
+        <w:rPr>
+          <w:b/>
+        </w:rPr>
+        <w:t>0.491 (chance)</w:t>
+      </w:r>
+      <w:r>
+        <w:t>.</w:t>
+      </w:r>
+    </w:p>
+    <w:p>
+      <w:r>
+        <w:rPr>
+          <w:b/>
+        </w:rPr>
+        <w:t>Peak deconvolution</w:t>
+      </w:r>
+      <w:r>
+        <w:t xml:space="preserve"> — the most direct attempt, actively fitting two overlapping Gaussians and measuring their separation and skewness (two unequal overlapping peaks sum to a skewed composite) — was itself at chance (0.53, size‑robust set excluding the voxel‑count‑confounded BIC), *below* chance at the clean threshold (0.375), added nothing to the HU‑shape moments (0.526→0.541), and was matched by a </w:t>
+      </w:r>
+      <w:r>
+        <w:rPr>
+          <w:b/>
+        </w:rPr>
+        <w:t>stone‑volume‑only baseline</w:t>
+      </w:r>
+      <w:r>
+        <w:t xml:space="preserve"> — what little varied was stone size, not bimodality. At clinical slice thickness (≈3 mm) partial‑volume averaging erases the two‑peak structure. The lamination is histologically real but not resolvable on single‑energy clinical CT: </w:t>
+      </w:r>
+      <w:r>
+        <w:rPr>
+          <w:b/>
+        </w:rPr>
+        <w:t>the multicomponent architecture that characterizes most stones is undetectable by any channel a standard ED visit provides</w:t>
+      </w:r>
+      <w:r>
+        <w:t xml:space="preserve"> — a reinforcement, at a coarser and better‑powered endpoint, of the composition‑subtyping boundary in Table S1.</w:t>
+      </w:r>
+    </w:p>
+    <w:p>
+      <w:pPr>
+        <w:pStyle w:val="Heading2"/>
+      </w:pPr>
+      <w:r>
+        <w:t>S6. Figures</w:t>
       </w:r>
     </w:p>
     <w:p>
@@ -2008,6 +3150,100 @@
       </w:r>
       <w:r>
         <w:t xml:space="preserve"> Five-class composition confusion matrix (row-normalized), patient-level cross-validation.</w:t>
+      </w:r>
+    </w:p>
+    <w:p>
+      <w:r>
+        <w:drawing>
+          <wp:inline xmlns:a="http://schemas.openxmlformats.org/drawingml/2006/main" xmlns:pic="http://schemas.openxmlformats.org/drawingml/2006/picture">
+            <wp:extent cx="5486400" cy="2094807"/>
+            <wp:docPr id="3" name="Picture 3"/>
+            <wp:cNvGraphicFramePr>
+              <a:graphicFrameLocks noChangeAspect="1"/>
+            </wp:cNvGraphicFramePr>
+            <a:graphic>
+              <a:graphicData uri="http://schemas.openxmlformats.org/drawingml/2006/picture">
+                <pic:pic>
+                  <pic:nvPicPr>
+                    <pic:cNvPr id="0" name="FigS3_decision_nodes.png"/>
+                    <pic:cNvPicPr/>
+                  </pic:nvPicPr>
+                  <pic:blipFill>
+                    <a:blip r:embed="rId11"/>
+                    <a:stretch>
+                      <a:fillRect/>
+                    </a:stretch>
+                  </pic:blipFill>
+                  <pic:spPr>
+                    <a:xfrm>
+                      <a:off x="0" y="0"/>
+                      <a:ext cx="5486400" cy="2094807"/>
+                    </a:xfrm>
+                    <a:prstGeom prst="rect"/>
+                  </pic:spPr>
+                </pic:pic>
+              </a:graphicData>
+            </a:graphic>
+          </wp:inline>
+        </w:drawing>
+      </w:r>
+    </w:p>
+    <w:p>
+      <w:r>
+        <w:rPr>
+          <w:b/>
+        </w:rPr>
+        <w:t>Figure S3.</w:t>
+      </w:r>
+      <w:r>
+        <w:t xml:space="preserve"> Decision-node performance (left) and the multicomponent threshold sweep (right). Routine data resolves the dissolvable decision (Node A, uric acid vs. non-UA) and a modest calcium-phosphate metabolic flag (Node C2), but multicomponent detection (Node C1) sits at chance and falls below it as the mixedness definition tightens.</w:t>
+      </w:r>
+    </w:p>
+    <w:p>
+      <w:r>
+        <w:drawing>
+          <wp:inline xmlns:a="http://schemas.openxmlformats.org/drawingml/2006/main" xmlns:pic="http://schemas.openxmlformats.org/drawingml/2006/picture">
+            <wp:extent cx="5486400" cy="4049486"/>
+            <wp:docPr id="4" name="Picture 4"/>
+            <wp:cNvGraphicFramePr>
+              <a:graphicFrameLocks noChangeAspect="1"/>
+            </wp:cNvGraphicFramePr>
+            <a:graphic>
+              <a:graphicData uri="http://schemas.openxmlformats.org/drawingml/2006/picture">
+                <pic:pic>
+                  <pic:nvPicPr>
+                    <pic:cNvPr id="0" name="FigS4_multicomponent.png"/>
+                    <pic:cNvPicPr/>
+                  </pic:nvPicPr>
+                  <pic:blipFill>
+                    <a:blip r:embed="rId12"/>
+                    <a:stretch>
+                      <a:fillRect/>
+                    </a:stretch>
+                  </pic:blipFill>
+                  <pic:spPr>
+                    <a:xfrm>
+                      <a:off x="0" y="0"/>
+                      <a:ext cx="5486400" cy="4049486"/>
+                    </a:xfrm>
+                    <a:prstGeom prst="rect"/>
+                  </pic:spPr>
+                </pic:pic>
+              </a:graphicData>
+            </a:graphic>
+          </wp:inline>
+        </w:drawing>
+      </w:r>
+    </w:p>
+    <w:p>
+      <w:r>
+        <w:rPr>
+          <w:b/>
+        </w:rPr>
+        <w:t>Figure S4.</w:t>
+      </w:r>
+      <w:r>
+        <w:t xml:space="preserve"> Exhaustive multicomponent detection — every feature family plus peak deconvolution against the single- vs. multi-component endpoint (thr 0.10; patient-clustered bootstrap 95% CI). All families cross or sit below chance; the lone combined "gain" (orange) is a uric-acid-purity confound (see Table S2).</w:t>
       </w:r>
     </w:p>
     <w:p>

</xml_diff>

<commit_message>
Supplement: add two-endpoint pointer in rationale (composition + multicomponent)
Co-Authored-By: Claude Opus 4.8 <noreply@anthropic.com>
</commit_message>
<xml_diff>
--- a/docs/02_DrStone_Supplement_FeatureLedger.docx
+++ b/docs/02_DrStone_Supplement_FeatureLedger.docx
@@ -75,7 +75,25 @@
         <w:t>HU + routine-labs</w:t>
       </w:r>
       <w:r>
-        <w:t xml:space="preserve"> baseline (AUROC 0.710). Cohort: 319 laboratory-analyzed stones from 223 patients (CaOx 107, CaP 144, UA 36, struvite 27, other 5).</w:t>
+        <w:t xml:space="preserve"> baseline (AUROC 0.710). Cohort: 319 laboratory-analyzed stones from 223 patients (CaOx 107, CaP 144, UA 36, struvite 27, other 5). The ledger spans two endpoints — </w:t>
+      </w:r>
+      <w:r>
+        <w:rPr>
+          <w:b/>
+        </w:rPr>
+        <w:t>composition</w:t>
+      </w:r>
+      <w:r>
+        <w:t xml:space="preserve"> (which stone type; Table S1) and </w:t>
+      </w:r>
+      <w:r>
+        <w:rPr>
+          <w:b/>
+        </w:rPr>
+        <w:t>multicomponent detection</w:t>
+      </w:r>
+      <w:r>
+        <w:t xml:space="preserve"> (whether a stone is mixed at all; Table S2, §S5).</w:t>
       </w:r>
     </w:p>
     <w:p>

</xml_diff>